<commit_message>
docs(lab08): align report and slides with lab01 template
</commit_message>
<xml_diff>
--- a/labs/lab08/report/_resources/docx/reference.docx
+++ b/labs/lab08/report/_resources/docx/reference.docx
@@ -1194,8 +1194,8 @@
     <w:name w:val="Verbatim Char"/>
     <w:basedOn w:val="BodyTextChar"/>
     <w:rPr>
-      <w:rFonts w:ascii="DejaVu Sans Mono" w:hAnsi="DejaVu Sans Mono" w:eastAsia="Menlo"/>
-      <w:sz w:val="16"/>
+      <w:rFonts w:ascii="Menlo" w:hAnsi="Menlo" w:eastAsia="Menlo"/>
+      <w:sz w:val="18"/>
     </w:rPr>
   </w:style>
   <w:style w:type="character" w:customStyle="1" w:styleId="SectionNumber">
@@ -1247,10 +1247,11 @@
       <w:spacing w:before="0" w:after="0" w:line="240" w:lineRule="auto"/>
       <w:ind w:left="85" w:right="85" w:firstLine="0"/>
       <w:jc w:val="left"/>
-    </w:pPr>
-    <w:rPr>
-      <w:rFonts w:ascii="DejaVu Sans Mono" w:hAnsi="DejaVu Sans Mono"/>
-      <w:sz w:val="16"/>
+      <w:shd w:val="clear" w:fill="f1f3f5"/>
+    </w:pPr>
+    <w:rPr>
+      <w:rFonts w:ascii="Menlo" w:hAnsi="Menlo"/>
+      <w:sz w:val="17"/>
     </w:rPr>
   </w:style>
 </w:styles>

</xml_diff>